<commit_message>
ca7 answering brief: docx/render.sh, pagemap.awk and footer.xml give way to fb render's needles (ca7-answering-brief.lua writes FORMBOOK_NEEDLES, FORMBOOK_FOOTERS and FORMBOOK_FINAL as the ported opening brief does); reference.xml names the face through {font}; .docx.pdf byte-identical, .docx differs only in footer part names and fb's unused footers; check.sh typst, latex, docx 0 failed, XENG-001..003 pass (fb-595.68.5)
</commit_message>
<xml_diff>
--- a/courts/seventh-circuit/court-of-appeals/answering-brief/usage/OUTPUT-answering-brief.docx
+++ b/courts/seventh-circuit/court-of-appeals/answering-brief/usage/OUTPUT-answering-brief.docx
@@ -6622,60 +6622,6 @@
 
 <file path=word/comments.xml><?xml version="1.0" encoding="utf-8"?>
 <w:comments xmlns:w="http://schemas.openxmlformats.org/wordprocessingml/2006/main" xmlns:m="http://schemas.openxmlformats.org/officeDocument/2006/math" xmlns:r="http://schemas.openxmlformats.org/officeDocument/2006/relationships" xmlns:o="urn:schemas-microsoft-com:office:office" xmlns:v="urn:schemas-microsoft-com:vml" xmlns:w10="urn:schemas-microsoft-com:office:word" xmlns:a="http://schemas.openxmlformats.org/drawingml/2006/main" xmlns:pic="http://schemas.openxmlformats.org/drawingml/2006/picture" xmlns:wp="http://schemas.openxmlformats.org/drawingml/2006/wordprocessingDrawing"/>
-</file>
-
-<file path=word/footer-arabic.xml><?xml version="1.0" encoding="utf-8"?>
-<w:ftr xmlns:w="http://schemas.openxmlformats.org/wordprocessingml/2006/main" xmlns:r="http://schemas.openxmlformats.org/officeDocument/2006/relationships">
-  <w:p>
-    <w:pPr>
-      <w:spacing w:before="0" w:after="0" w:line="240" w:lineRule="auto"/>
-      <w:ind w:firstLine="0"/>
-      <w:jc w:val="center"/>
-    </w:pPr>
-    <w:r>
-      <w:fldChar w:fldCharType="begin"/>
-    </w:r>
-    <w:r>
-      <w:instrText xml:space="preserve"> PAGE </w:instrText>
-    </w:r>
-    <w:r>
-      <w:fldChar w:fldCharType="separate"/>
-    </w:r>
-    <w:r>
-      <w:t>1</w:t>
-    </w:r>
-    <w:r>
-      <w:fldChar w:fldCharType="end"/>
-    </w:r>
-  </w:p>
-</w:ftr>
-</file>
-
-<file path=word/footer-roman.xml><?xml version="1.0" encoding="utf-8"?>
-<w:ftr xmlns:w="http://schemas.openxmlformats.org/wordprocessingml/2006/main" xmlns:r="http://schemas.openxmlformats.org/officeDocument/2006/relationships">
-  <w:p>
-    <w:pPr>
-      <w:spacing w:before="0" w:after="0" w:line="240" w:lineRule="auto"/>
-      <w:ind w:firstLine="0"/>
-      <w:jc w:val="center"/>
-    </w:pPr>
-    <w:r>
-      <w:fldChar w:fldCharType="begin"/>
-    </w:r>
-    <w:r>
-      <w:instrText xml:space="preserve"> PAGE </w:instrText>
-    </w:r>
-    <w:r>
-      <w:fldChar w:fldCharType="separate"/>
-    </w:r>
-    <w:r>
-      <w:t>1</w:t>
-    </w:r>
-    <w:r>
-      <w:fldChar w:fldCharType="end"/>
-    </w:r>
-  </w:p>
-</w:ftr>
 </file>
 
 <file path=word/footer1.xml><?xml version="1.0" encoding="utf-8"?>
@@ -6814,6 +6760,126 @@
     </w:p>
   </w:footnote>
 </w:footnotes>
+</file>
+
+<file path=word/ftr-add.xml><?xml version="1.0" encoding="utf-8"?>
+<w:ftr xmlns:w="http://schemas.openxmlformats.org/wordprocessingml/2006/main" xmlns:r="http://schemas.openxmlformats.org/officeDocument/2006/relationships">
+  <w:p>
+    <w:pPr>
+      <w:spacing w:before="0" w:after="0"/>
+      <w:jc w:val="center"/>
+    </w:pPr>
+    <w:r>
+      <w:t>Add-</w:t>
+    </w:r>
+    <w:r>
+      <w:fldChar w:fldCharType="begin"/>
+    </w:r>
+    <w:r>
+      <w:instrText xml:space="preserve"> PAGE </w:instrText>
+    </w:r>
+    <w:r>
+      <w:fldChar w:fldCharType="separate"/>
+    </w:r>
+    <w:r>
+      <w:t>1</w:t>
+    </w:r>
+    <w:r>
+      <w:fldChar w:fldCharType="end"/>
+    </w:r>
+  </w:p>
+</w:ftr>
+</file>
+
+<file path=word/ftr-none.xml><?xml version="1.0" encoding="utf-8"?>
+<w:ftr xmlns:w="http://schemas.openxmlformats.org/wordprocessingml/2006/main" xmlns:r="http://schemas.openxmlformats.org/officeDocument/2006/relationships">
+  <w:p>
+    <w:pPr>
+      <w:spacing w:before="0" w:after="0"/>
+      <w:jc w:val="center"/>
+    </w:pPr>
+  </w:p>
+</w:ftr>
+</file>
+
+<file path=word/ftr-own1.xml><?xml version="1.0" encoding="utf-8"?>
+<w:ftr xmlns:w="http://schemas.openxmlformats.org/wordprocessingml/2006/main" xmlns:r="http://schemas.openxmlformats.org/officeDocument/2006/relationships">
+  <w:p>
+    <w:pPr>
+      <w:spacing w:before="0" w:after="0" w:line="240" w:lineRule="auto"/>
+      <w:ind w:firstLine="0"/>
+      <w:jc w:val="center"/>
+    </w:pPr>
+    <w:r>
+      <w:fldChar w:fldCharType="begin"/>
+    </w:r>
+    <w:r>
+      <w:instrText xml:space="preserve"> PAGE </w:instrText>
+    </w:r>
+    <w:r>
+      <w:fldChar w:fldCharType="separate"/>
+    </w:r>
+    <w:r>
+      <w:t>1</w:t>
+    </w:r>
+    <w:r>
+      <w:fldChar w:fldCharType="end"/>
+    </w:r>
+  </w:p>
+</w:ftr>
+</file>
+
+<file path=word/ftr-own2.xml><?xml version="1.0" encoding="utf-8"?>
+<w:ftr xmlns:w="http://schemas.openxmlformats.org/wordprocessingml/2006/main" xmlns:r="http://schemas.openxmlformats.org/officeDocument/2006/relationships">
+  <w:p>
+    <w:pPr>
+      <w:spacing w:before="0" w:after="0" w:line="240" w:lineRule="auto"/>
+      <w:ind w:firstLine="0"/>
+      <w:jc w:val="center"/>
+    </w:pPr>
+    <w:r>
+      <w:fldChar w:fldCharType="begin"/>
+    </w:r>
+    <w:r>
+      <w:instrText xml:space="preserve"> PAGE </w:instrText>
+    </w:r>
+    <w:r>
+      <w:fldChar w:fldCharType="separate"/>
+    </w:r>
+    <w:r>
+      <w:t>1</w:t>
+    </w:r>
+    <w:r>
+      <w:fldChar w:fldCharType="end"/>
+    </w:r>
+  </w:p>
+</w:ftr>
+</file>
+
+<file path=word/ftr-page.xml><?xml version="1.0" encoding="utf-8"?>
+<w:ftr xmlns:w="http://schemas.openxmlformats.org/wordprocessingml/2006/main" xmlns:r="http://schemas.openxmlformats.org/officeDocument/2006/relationships">
+  <w:p>
+    <w:pPr>
+      <w:spacing w:before="0" w:after="0"/>
+      <w:jc w:val="center"/>
+    </w:pPr>
+    <w:r>
+      <w:fldChar w:fldCharType="begin"/>
+    </w:r>
+    <w:r>
+      <w:instrText xml:space="preserve"> PAGE </w:instrText>
+    </w:r>
+    <w:r>
+      <w:fldChar w:fldCharType="separate"/>
+    </w:r>
+    <w:r>
+      <w:t>1</w:t>
+    </w:r>
+    <w:r>
+      <w:fldChar w:fldCharType="end"/>
+    </w:r>
+  </w:p>
+</w:ftr>
 </file>
 
 <file path=word/numbering.xml><?xml version="1.0" encoding="utf-8"?>

</xml_diff>